<commit_message>
feat: refine homepage hero and assets
</commit_message>
<xml_diff>
--- a/assets/resume/Martinus_Alvin_Haryanto_Resume.docx
+++ b/assets/resume/Martinus_Alvin_Haryanto_Resume.docx
@@ -22,6 +22,7 @@
         <w:spacing w:after="120"/>
         <w:jc w:val="center"/>
         <w:rPr>
+          <w:rStyle w:val="Hyperlink"/>
           <w:sz w:val="18"/>
           <w:szCs w:val="18"/>
         </w:rPr>
@@ -32,36 +33,37 @@
           <w:sz w:val="18"/>
           <w:szCs w:val="18"/>
         </w:rPr>
-        <w:t>martinus.haryanto</w:t>
-      </w:r>
+        <w:t>martinus.haryanto@binus.ac.id  |</w:t>
+      </w:r>
+      <w:proofErr w:type="gramEnd"/>
       <w:r>
         <w:rPr>
           <w:sz w:val="18"/>
           <w:szCs w:val="18"/>
         </w:rPr>
-        <w:t>@binus.ac.id  |</w:t>
-      </w:r>
-      <w:proofErr w:type="gramEnd"/>
+        <w:t xml:space="preserve">  </w:t>
+      </w:r>
       <w:r>
         <w:rPr>
           <w:sz w:val="18"/>
           <w:szCs w:val="18"/>
         </w:rPr>
-        <w:t xml:space="preserve">  </w:t>
-      </w:r>
+        <w:t xml:space="preserve">+62 882 3900 </w:t>
+      </w:r>
+      <w:proofErr w:type="gramStart"/>
       <w:r>
         <w:rPr>
           <w:sz w:val="18"/>
           <w:szCs w:val="18"/>
         </w:rPr>
-        <w:t>+62 8</w:t>
+        <w:t>3390</w:t>
       </w:r>
       <w:r>
         <w:rPr>
           <w:sz w:val="18"/>
           <w:szCs w:val="18"/>
         </w:rPr>
-        <w:t>82</w:t>
+        <w:t xml:space="preserve"> </w:t>
       </w:r>
       <w:r>
         <w:rPr>
@@ -75,45 +77,9 @@
           <w:sz w:val="18"/>
           <w:szCs w:val="18"/>
         </w:rPr>
-        <w:t>3900</w:t>
-      </w:r>
-      <w:r>
-        <w:rPr>
-          <w:sz w:val="18"/>
-          <w:szCs w:val="18"/>
-        </w:rPr>
-        <w:t xml:space="preserve"> </w:t>
-      </w:r>
-      <w:proofErr w:type="gramStart"/>
-      <w:r>
-        <w:rPr>
-          <w:sz w:val="18"/>
-          <w:szCs w:val="18"/>
-        </w:rPr>
-        <w:t>3390</w:t>
-      </w:r>
-      <w:r>
-        <w:rPr>
-          <w:sz w:val="18"/>
-          <w:szCs w:val="18"/>
-        </w:rPr>
-        <w:t xml:space="preserve"> </w:t>
-      </w:r>
-      <w:r>
-        <w:rPr>
-          <w:sz w:val="18"/>
-          <w:szCs w:val="18"/>
-        </w:rPr>
-        <w:t xml:space="preserve"> |</w:t>
+        <w:t>|</w:t>
       </w:r>
       <w:proofErr w:type="gramEnd"/>
-      <w:r>
-        <w:rPr>
-          <w:sz w:val="18"/>
-          <w:szCs w:val="18"/>
-        </w:rPr>
-        <w:t xml:space="preserve"> </w:t>
-      </w:r>
       <w:r>
         <w:rPr>
           <w:sz w:val="18"/>
@@ -128,70 +94,7 @@
             <w:sz w:val="18"/>
             <w:szCs w:val="18"/>
           </w:rPr>
-          <w:t>github.com/</w:t>
-        </w:r>
-        <w:r>
-          <w:rPr>
-            <w:rStyle w:val="Hyperlink"/>
-            <w:sz w:val="18"/>
-            <w:szCs w:val="18"/>
-          </w:rPr>
-          <w:t>A</w:t>
-        </w:r>
-        <w:r>
-          <w:rPr>
-            <w:rStyle w:val="Hyperlink"/>
-            <w:sz w:val="18"/>
-            <w:szCs w:val="18"/>
-          </w:rPr>
-          <w:t>lvin0628</w:t>
-        </w:r>
-      </w:hyperlink>
-      <w:r>
-        <w:rPr>
-          <w:sz w:val="18"/>
-          <w:szCs w:val="18"/>
-        </w:rPr>
-        <w:t xml:space="preserve"> </w:t>
-      </w:r>
-      <w:r>
-        <w:rPr>
-          <w:sz w:val="18"/>
-          <w:szCs w:val="18"/>
-        </w:rPr>
-        <w:t xml:space="preserve"> |</w:t>
-      </w:r>
-      <w:r>
-        <w:rPr>
-          <w:sz w:val="18"/>
-          <w:szCs w:val="18"/>
-        </w:rPr>
-        <w:t xml:space="preserve">  </w:t>
-      </w:r>
-      <w:hyperlink r:id="rId6" w:history="1">
-        <w:r>
-          <w:rPr>
-            <w:rStyle w:val="Hyperlink"/>
-            <w:sz w:val="18"/>
-            <w:szCs w:val="18"/>
-          </w:rPr>
-          <w:t>linkedin.com/i</w:t>
-        </w:r>
-        <w:r>
-          <w:rPr>
-            <w:rStyle w:val="Hyperlink"/>
-            <w:sz w:val="18"/>
-            <w:szCs w:val="18"/>
-          </w:rPr>
-          <w:t>n</w:t>
-        </w:r>
-        <w:r>
-          <w:rPr>
-            <w:rStyle w:val="Hyperlink"/>
-            <w:sz w:val="18"/>
-            <w:szCs w:val="18"/>
-          </w:rPr>
-          <w:t>/</w:t>
+          <w:t xml:space="preserve">Martinus Alvin Haryanto </w:t>
         </w:r>
         <w:proofErr w:type="spellStart"/>
         <w:r>
@@ -200,34 +103,101 @@
             <w:sz w:val="18"/>
             <w:szCs w:val="18"/>
           </w:rPr>
-          <w:t>martinus-al</w:t>
+          <w:t>Portofolio</w:t>
         </w:r>
+        <w:proofErr w:type="spellEnd"/>
+      </w:hyperlink>
+      <w:r>
+        <w:rPr>
+          <w:sz w:val="18"/>
+          <w:szCs w:val="18"/>
+        </w:rPr>
+        <w:t xml:space="preserve"> </w:t>
+      </w:r>
+      <w:r>
+        <w:rPr>
+          <w:sz w:val="18"/>
+          <w:szCs w:val="18"/>
+        </w:rPr>
+        <w:t xml:space="preserve">| </w:t>
+      </w:r>
+      <w:r>
+        <w:rPr>
+          <w:sz w:val="18"/>
+          <w:szCs w:val="18"/>
+        </w:rPr>
+        <w:t xml:space="preserve"> </w:t>
+      </w:r>
+      <w:hyperlink r:id="rId6" w:history="1">
+        <w:proofErr w:type="spellStart"/>
         <w:r>
           <w:rPr>
             <w:rStyle w:val="Hyperlink"/>
             <w:sz w:val="18"/>
             <w:szCs w:val="18"/>
           </w:rPr>
-          <w:t>v</w:t>
-        </w:r>
-        <w:r>
-          <w:rPr>
-            <w:rStyle w:val="Hyperlink"/>
-            <w:sz w:val="18"/>
-            <w:szCs w:val="18"/>
-          </w:rPr>
-          <w:t>in-haryanto</w:t>
+          <w:t>Github</w:t>
         </w:r>
         <w:proofErr w:type="spellEnd"/>
-        <w:r>
-          <w:rPr>
-            <w:rStyle w:val="Hyperlink"/>
-            <w:sz w:val="18"/>
-            <w:szCs w:val="18"/>
-          </w:rPr>
-          <w:t>/</w:t>
-        </w:r>
       </w:hyperlink>
+      <w:r>
+        <w:rPr>
+          <w:sz w:val="18"/>
+          <w:szCs w:val="18"/>
+        </w:rPr>
+        <w:t xml:space="preserve"> </w:t>
+      </w:r>
+      <w:r>
+        <w:rPr>
+          <w:sz w:val="18"/>
+          <w:szCs w:val="18"/>
+        </w:rPr>
+        <w:t>|</w:t>
+      </w:r>
+      <w:r>
+        <w:rPr>
+          <w:sz w:val="18"/>
+          <w:szCs w:val="18"/>
+        </w:rPr>
+        <w:t xml:space="preserve">  </w:t>
+      </w:r>
+      <w:r>
+        <w:rPr>
+          <w:sz w:val="18"/>
+          <w:szCs w:val="18"/>
+        </w:rPr>
+        <w:fldChar w:fldCharType="begin"/>
+      </w:r>
+      <w:r>
+        <w:rPr>
+          <w:sz w:val="18"/>
+          <w:szCs w:val="18"/>
+        </w:rPr>
+        <w:instrText>HYPERLINK "https://www.linkedin.com/in/martinus-alvin-haryanto/"</w:instrText>
+      </w:r>
+      <w:r>
+        <w:rPr>
+          <w:sz w:val="18"/>
+          <w:szCs w:val="18"/>
+        </w:rPr>
+      </w:r>
+      <w:r>
+        <w:rPr>
+          <w:sz w:val="18"/>
+          <w:szCs w:val="18"/>
+        </w:rPr>
+        <w:fldChar w:fldCharType="separate"/>
+      </w:r>
+      <w:proofErr w:type="spellStart"/>
+      <w:r>
+        <w:rPr>
+          <w:rStyle w:val="Hyperlink"/>
+          <w:sz w:val="18"/>
+          <w:szCs w:val="18"/>
+        </w:rPr>
+        <w:t>Linkedin</w:t>
+      </w:r>
+      <w:proofErr w:type="spellEnd"/>
     </w:p>
     <w:p>
       <w:pPr>
@@ -239,6 +209,13 @@
       </w:pPr>
       <w:r>
         <w:rPr>
+          <w:sz w:val="18"/>
+          <w:szCs w:val="18"/>
+        </w:rPr>
+        <w:fldChar w:fldCharType="end"/>
+      </w:r>
+      <w:r>
+        <w:rPr>
           <w:b/>
           <w:bCs/>
           <w:caps/>
@@ -416,19 +393,7 @@
           <w:rPr>
             <w:rStyle w:val="Hyperlink"/>
           </w:rPr>
-          <w:t>Paper and So</w:t>
-        </w:r>
-        <w:r>
-          <w:rPr>
-            <w:rStyle w:val="Hyperlink"/>
-          </w:rPr>
-          <w:t>u</w:t>
-        </w:r>
-        <w:r>
-          <w:rPr>
-            <w:rStyle w:val="Hyperlink"/>
-          </w:rPr>
-          <w:t>rce Code</w:t>
+          <w:t>Paper and Source Code</w:t>
         </w:r>
       </w:hyperlink>
       <w:r>
@@ -576,49 +541,7 @@
           <w:i/>
           <w:iCs/>
         </w:rPr>
-        <w:t>Oct</w:t>
-      </w:r>
-      <w:r>
-        <w:rPr>
-          <w:i/>
-          <w:iCs/>
-        </w:rPr>
-        <w:t xml:space="preserve"> 202</w:t>
-      </w:r>
-      <w:r>
-        <w:rPr>
-          <w:i/>
-          <w:iCs/>
-        </w:rPr>
-        <w:t>4</w:t>
-      </w:r>
-      <w:r>
-        <w:rPr>
-          <w:i/>
-          <w:iCs/>
-        </w:rPr>
-        <w:t xml:space="preserve"> – </w:t>
-      </w:r>
-      <w:r>
-        <w:rPr>
-          <w:i/>
-          <w:iCs/>
-        </w:rPr>
-        <w:t>Oct</w:t>
-      </w:r>
-      <w:r>
-        <w:rPr>
-          <w:i/>
-          <w:iCs/>
-        </w:rPr>
-        <w:t xml:space="preserve"> 202</w:t>
-      </w:r>
-      <w:r>
-        <w:rPr>
-          <w:i/>
-          <w:iCs/>
-        </w:rPr>
-        <w:t>5</w:t>
+        <w:t>Oct 2024 – Oct 2025</w:t>
       </w:r>
     </w:p>
     <w:p>
@@ -719,28 +642,7 @@
           <w:iCs/>
         </w:rPr>
         <w:tab/>
-        <w:t>Sept</w:t>
-      </w:r>
-      <w:r>
-        <w:rPr>
-          <w:i/>
-          <w:iCs/>
-        </w:rPr>
-        <w:t xml:space="preserve"> 2025 – </w:t>
-      </w:r>
-      <w:r>
-        <w:rPr>
-          <w:i/>
-          <w:iCs/>
-        </w:rPr>
-        <w:t>Sept</w:t>
-      </w:r>
-      <w:r>
-        <w:rPr>
-          <w:i/>
-          <w:iCs/>
-        </w:rPr>
-        <w:t xml:space="preserve"> 2026</w:t>
+        <w:t>Sept 2025 – Sept 2026</w:t>
       </w:r>
     </w:p>
     <w:p>
@@ -949,19 +851,7 @@
           <w:rPr>
             <w:rStyle w:val="Hyperlink"/>
           </w:rPr>
-          <w:t>Dashb</w:t>
-        </w:r>
-        <w:r>
-          <w:rPr>
-            <w:rStyle w:val="Hyperlink"/>
-          </w:rPr>
-          <w:t>o</w:t>
-        </w:r>
-        <w:r>
-          <w:rPr>
-            <w:rStyle w:val="Hyperlink"/>
-          </w:rPr>
-          <w:t>ard</w:t>
+          <w:t>Dashboard</w:t>
         </w:r>
       </w:hyperlink>
       <w:r>
@@ -972,19 +862,7 @@
           <w:rPr>
             <w:rStyle w:val="Hyperlink"/>
           </w:rPr>
-          <w:t>Git</w:t>
-        </w:r>
-        <w:r>
-          <w:rPr>
-            <w:rStyle w:val="Hyperlink"/>
-          </w:rPr>
-          <w:t>H</w:t>
-        </w:r>
-        <w:r>
-          <w:rPr>
-            <w:rStyle w:val="Hyperlink"/>
-          </w:rPr>
-          <w:t>ub</w:t>
+          <w:t>GitHub</w:t>
         </w:r>
       </w:hyperlink>
     </w:p>
@@ -1090,6 +968,195 @@
       <w:proofErr w:type="spellEnd"/>
       <w:r>
         <w:t xml:space="preserve"> dashboard for live pipeline health, model performance, and predictions, pulling DAG status straight from the Airflow API.</w:t>
+      </w:r>
+    </w:p>
+    <w:p>
+      <w:pPr>
+        <w:spacing w:after="40"/>
+        <w:rPr>
+          <w:b/>
+          <w:bCs/>
+        </w:rPr>
+      </w:pPr>
+      <w:proofErr w:type="spellStart"/>
+      <w:r>
+        <w:rPr>
+          <w:b/>
+          <w:bCs/>
+        </w:rPr>
+        <w:t>NutriVision</w:t>
+      </w:r>
+      <w:proofErr w:type="spellEnd"/>
+      <w:r>
+        <w:rPr>
+          <w:b/>
+          <w:bCs/>
+        </w:rPr>
+        <w:t xml:space="preserve"> Pro — Computer Vision &amp; </w:t>
+      </w:r>
+      <w:proofErr w:type="spellStart"/>
+      <w:r>
+        <w:rPr>
+          <w:b/>
+          <w:bCs/>
+        </w:rPr>
+        <w:t>MLOps</w:t>
+      </w:r>
+      <w:proofErr w:type="spellEnd"/>
+      <w:r>
+        <w:rPr>
+          <w:b/>
+          <w:bCs/>
+        </w:rPr>
+        <w:t xml:space="preserve"> Cloud Platform</w:t>
+      </w:r>
+      <w:r>
+        <w:rPr>
+          <w:b/>
+          <w:bCs/>
+        </w:rPr>
+        <w:tab/>
+      </w:r>
+      <w:r>
+        <w:rPr>
+          <w:b/>
+          <w:bCs/>
+        </w:rPr>
+        <w:tab/>
+      </w:r>
+      <w:r>
+        <w:rPr>
+          <w:b/>
+          <w:bCs/>
+        </w:rPr>
+        <w:tab/>
+      </w:r>
+      <w:r>
+        <w:rPr>
+          <w:b/>
+          <w:bCs/>
+        </w:rPr>
+        <w:tab/>
+      </w:r>
+      <w:r>
+        <w:rPr>
+          <w:b/>
+          <w:bCs/>
+        </w:rPr>
+        <w:tab/>
+        <w:t xml:space="preserve">     </w:t>
+      </w:r>
+      <w:r>
+        <w:rPr>
+          <w:i/>
+          <w:iCs/>
+        </w:rPr>
+        <w:t>Sept</w:t>
+      </w:r>
+      <w:r>
+        <w:rPr>
+          <w:i/>
+          <w:iCs/>
+        </w:rPr>
+        <w:t xml:space="preserve"> 2026</w:t>
+      </w:r>
+    </w:p>
+    <w:p>
+      <w:pPr>
+        <w:spacing w:after="40"/>
+      </w:pPr>
+      <w:hyperlink r:id="rId10" w:history="1">
+        <w:r>
+          <w:rPr>
+            <w:rStyle w:val="Hyperlink"/>
+          </w:rPr>
+          <w:t>Live Web App</w:t>
+        </w:r>
+      </w:hyperlink>
+      <w:r>
+        <w:t xml:space="preserve"> | </w:t>
+      </w:r>
+      <w:hyperlink r:id="rId11" w:history="1">
+        <w:proofErr w:type="spellStart"/>
+        <w:r>
+          <w:rPr>
+            <w:rStyle w:val="Hyperlink"/>
+          </w:rPr>
+          <w:t>Github</w:t>
+        </w:r>
+        <w:proofErr w:type="spellEnd"/>
+      </w:hyperlink>
+    </w:p>
+    <w:p>
+      <w:pPr>
+        <w:pStyle w:val="ListParagraph"/>
+        <w:numPr>
+          <w:ilvl w:val="0"/>
+          <w:numId w:val="1"/>
+        </w:numPr>
+        <w:spacing w:after="40"/>
+        <w:ind w:left="288" w:hanging="215"/>
+      </w:pPr>
+      <w:r>
+        <w:t>Architected and deployed a production-grade Computer Vision backend on AWS EC2 and Amazon S3, containerized via Docker &amp; Docker Compose, serving a fine-tuned YOLOv11 instance segmentation model for real-time nutritional scanning and multi-class food item analysis.</w:t>
+      </w:r>
+    </w:p>
+    <w:p>
+      <w:pPr>
+        <w:pStyle w:val="ListParagraph"/>
+        <w:numPr>
+          <w:ilvl w:val="0"/>
+          <w:numId w:val="1"/>
+        </w:numPr>
+        <w:spacing w:after="40"/>
+        <w:ind w:left="288" w:hanging="215"/>
+      </w:pPr>
+      <w:r>
+        <w:t xml:space="preserve">Automated a zero-downtime CI/CD pipeline using GitHub Actions and AWS ECR, ensuring seamless image building, registry syncing, and </w:t>
+      </w:r>
+      <w:proofErr w:type="gramStart"/>
+      <w:r>
+        <w:t>secure .env</w:t>
+      </w:r>
+      <w:proofErr w:type="gramEnd"/>
+      <w:r>
+        <w:t xml:space="preserve"> secret injection.</w:t>
+      </w:r>
+    </w:p>
+    <w:p>
+      <w:pPr>
+        <w:pStyle w:val="ListParagraph"/>
+        <w:numPr>
+          <w:ilvl w:val="0"/>
+          <w:numId w:val="1"/>
+        </w:numPr>
+        <w:spacing w:after="40"/>
+        <w:ind w:left="288" w:hanging="215"/>
+      </w:pPr>
+      <w:r>
+        <w:t xml:space="preserve">Engineered a secure </w:t>
+      </w:r>
+      <w:proofErr w:type="spellStart"/>
+      <w:r>
+        <w:t>FastAPI</w:t>
+      </w:r>
+      <w:proofErr w:type="spellEnd"/>
+      <w:r>
+        <w:t xml:space="preserve"> service featuring cryptographic admin header validation (x-admin-token), dynamic ONNX model reloading, and Redis caching.</w:t>
+      </w:r>
+    </w:p>
+    <w:p>
+      <w:pPr>
+        <w:pStyle w:val="ListParagraph"/>
+        <w:numPr>
+          <w:ilvl w:val="0"/>
+          <w:numId w:val="1"/>
+        </w:numPr>
+        <w:spacing w:after="40"/>
+        <w:ind w:left="288" w:hanging="215"/>
+      </w:pPr>
+      <w:r>
+        <w:t>Implemented cloud-native storage and retrieval workflows, enabling the API to fetch production-ready ONNX model weights directly from private S3 buckets on startup with built-in fallback verification and automated health-check endpoints.</w:t>
       </w:r>
     </w:p>
     <w:p>
@@ -1266,6 +1333,118 @@
 <file path=word/numbering.xml><?xml version="1.0" encoding="utf-8"?>
 <w:numbering xmlns:wpc="http://schemas.microsoft.com/office/word/2010/wordprocessingCanvas" xmlns:cx="http://schemas.microsoft.com/office/drawing/2014/chartex" xmlns:cx1="http://schemas.microsoft.com/office/drawing/2015/9/8/chartex" xmlns:cx2="http://schemas.microsoft.com/office/drawing/2015/10/21/chartex" xmlns:cx3="http://schemas.microsoft.com/office/drawing/2016/5/9/chartex" xmlns:cx4="http://schemas.microsoft.com/office/drawing/2016/5/10/chartex" xmlns:cx5="http://schemas.microsoft.com/office/drawing/2016/5/11/chartex" xmlns:cx6="http://schemas.microsoft.com/office/drawing/2016/5/12/chartex" xmlns:cx7="http://schemas.microsoft.com/office/drawing/2016/5/13/chartex" xmlns:cx8="http://schemas.microsoft.com/office/drawing/2016/5/14/chartex" xmlns:mc="http://schemas.openxmlformats.org/markup-compatibility/2006" xmlns:aink="http://schemas.microsoft.com/office/drawing/2016/ink" xmlns:am3d="http://schemas.microsoft.com/office/drawing/2017/model3d" xmlns:o="urn:schemas-microsoft-com:office:office" xmlns:oel="http://schemas.microsoft.com/office/2019/extlst" xmlns:r="http://schemas.openxmlformats.org/officeDocument/2006/relationships" xmlns:m="http://schemas.openxmlformats.org/officeDocument/2006/math" xmlns:v="urn:schemas-microsoft-com:vml" xmlns:wp14="http://schemas.microsoft.com/office/word/2010/wordprocessingDrawing" xmlns:wp="http://schemas.openxmlformats.org/drawingml/2006/wordprocessingDrawing" xmlns:w10="urn:schemas-microsoft-com:office:word" xmlns:w="http://schemas.openxmlformats.org/wordprocessingml/2006/main" xmlns:w14="http://schemas.microsoft.com/office/word/2010/wordml" xmlns:w15="http://schemas.microsoft.com/office/word/2012/wordml" xmlns:w16cex="http://schemas.microsoft.com/office/word/2018/wordml/cex" xmlns:w16cid="http://schemas.microsoft.com/office/word/2016/wordml/cid" xmlns:w16="http://schemas.microsoft.com/office/word/2018/wordml" xmlns:w16du="http://schemas.microsoft.com/office/word/2023/wordml/word16du" xmlns:w16sdtdh="http://schemas.microsoft.com/office/word/2020/wordml/sdtdatahash" xmlns:w16sdtfl="http://schemas.microsoft.com/office/word/2024/wordml/sdtformatlock" xmlns:w16se="http://schemas.microsoft.com/office/word/2015/wordml/symex" xmlns:wpg="http://schemas.microsoft.com/office/word/2010/wordprocessingGroup" xmlns:wpi="http://schemas.microsoft.com/office/word/2010/wordprocessingInk" xmlns:wne="http://schemas.microsoft.com/office/word/2006/wordml" xmlns:wps="http://schemas.microsoft.com/office/word/2010/wordprocessingShape" mc:Ignorable="w14 w15 w16se w16cid w16 w16cex w16sdtdh w16sdtfl w16du wp14">
   <w:abstractNum w:abstractNumId="0" w15:restartNumberingAfterBreak="0">
+    <w:nsid w:val="0BCD6BE8"/>
+    <w:multiLevelType w:val="hybridMultilevel"/>
+    <w:tmpl w:val="D9C0544E"/>
+    <w:lvl w:ilvl="0" w:tplc="50A0623A">
+      <w:numFmt w:val="bullet"/>
+      <w:lvlText w:val="-"/>
+      <w:lvlJc w:val="left"/>
+      <w:pPr>
+        <w:ind w:left="720" w:hanging="360"/>
+      </w:pPr>
+      <w:rPr>
+        <w:rFonts w:ascii="Times New Roman" w:eastAsia="Times New Roman" w:hAnsi="Times New Roman" w:cs="Times New Roman" w:hint="default"/>
+      </w:rPr>
+    </w:lvl>
+    <w:lvl w:ilvl="1" w:tplc="38090003" w:tentative="1">
+      <w:start w:val="1"/>
+      <w:numFmt w:val="bullet"/>
+      <w:lvlText w:val="o"/>
+      <w:lvlJc w:val="left"/>
+      <w:pPr>
+        <w:ind w:left="1440" w:hanging="360"/>
+      </w:pPr>
+      <w:rPr>
+        <w:rFonts w:ascii="Courier New" w:hAnsi="Courier New" w:cs="Courier New" w:hint="default"/>
+      </w:rPr>
+    </w:lvl>
+    <w:lvl w:ilvl="2" w:tplc="38090005" w:tentative="1">
+      <w:start w:val="1"/>
+      <w:numFmt w:val="bullet"/>
+      <w:lvlText w:val=""/>
+      <w:lvlJc w:val="left"/>
+      <w:pPr>
+        <w:ind w:left="2160" w:hanging="360"/>
+      </w:pPr>
+      <w:rPr>
+        <w:rFonts w:ascii="Wingdings" w:hAnsi="Wingdings" w:hint="default"/>
+      </w:rPr>
+    </w:lvl>
+    <w:lvl w:ilvl="3" w:tplc="38090001" w:tentative="1">
+      <w:start w:val="1"/>
+      <w:numFmt w:val="bullet"/>
+      <w:lvlText w:val=""/>
+      <w:lvlJc w:val="left"/>
+      <w:pPr>
+        <w:ind w:left="2880" w:hanging="360"/>
+      </w:pPr>
+      <w:rPr>
+        <w:rFonts w:ascii="Symbol" w:hAnsi="Symbol" w:hint="default"/>
+      </w:rPr>
+    </w:lvl>
+    <w:lvl w:ilvl="4" w:tplc="38090003" w:tentative="1">
+      <w:start w:val="1"/>
+      <w:numFmt w:val="bullet"/>
+      <w:lvlText w:val="o"/>
+      <w:lvlJc w:val="left"/>
+      <w:pPr>
+        <w:ind w:left="3600" w:hanging="360"/>
+      </w:pPr>
+      <w:rPr>
+        <w:rFonts w:ascii="Courier New" w:hAnsi="Courier New" w:cs="Courier New" w:hint="default"/>
+      </w:rPr>
+    </w:lvl>
+    <w:lvl w:ilvl="5" w:tplc="38090005" w:tentative="1">
+      <w:start w:val="1"/>
+      <w:numFmt w:val="bullet"/>
+      <w:lvlText w:val=""/>
+      <w:lvlJc w:val="left"/>
+      <w:pPr>
+        <w:ind w:left="4320" w:hanging="360"/>
+      </w:pPr>
+      <w:rPr>
+        <w:rFonts w:ascii="Wingdings" w:hAnsi="Wingdings" w:hint="default"/>
+      </w:rPr>
+    </w:lvl>
+    <w:lvl w:ilvl="6" w:tplc="38090001" w:tentative="1">
+      <w:start w:val="1"/>
+      <w:numFmt w:val="bullet"/>
+      <w:lvlText w:val=""/>
+      <w:lvlJc w:val="left"/>
+      <w:pPr>
+        <w:ind w:left="5040" w:hanging="360"/>
+      </w:pPr>
+      <w:rPr>
+        <w:rFonts w:ascii="Symbol" w:hAnsi="Symbol" w:hint="default"/>
+      </w:rPr>
+    </w:lvl>
+    <w:lvl w:ilvl="7" w:tplc="38090003" w:tentative="1">
+      <w:start w:val="1"/>
+      <w:numFmt w:val="bullet"/>
+      <w:lvlText w:val="o"/>
+      <w:lvlJc w:val="left"/>
+      <w:pPr>
+        <w:ind w:left="5760" w:hanging="360"/>
+      </w:pPr>
+      <w:rPr>
+        <w:rFonts w:ascii="Courier New" w:hAnsi="Courier New" w:cs="Courier New" w:hint="default"/>
+      </w:rPr>
+    </w:lvl>
+    <w:lvl w:ilvl="8" w:tplc="38090005" w:tentative="1">
+      <w:start w:val="1"/>
+      <w:numFmt w:val="bullet"/>
+      <w:lvlText w:val=""/>
+      <w:lvlJc w:val="left"/>
+      <w:pPr>
+        <w:ind w:left="6480" w:hanging="360"/>
+      </w:pPr>
+      <w:rPr>
+        <w:rFonts w:ascii="Wingdings" w:hAnsi="Wingdings" w:hint="default"/>
+      </w:rPr>
+    </w:lvl>
+  </w:abstractNum>
+  <w:abstractNum w:abstractNumId="1" w15:restartNumberingAfterBreak="0">
     <w:nsid w:val="149E37A8"/>
     <w:multiLevelType w:val="hybridMultilevel"/>
     <w:tmpl w:val="D4A0891E"/>
@@ -1379,7 +1558,7 @@
       </w:rPr>
     </w:lvl>
   </w:abstractNum>
-  <w:abstractNum w:abstractNumId="1" w15:restartNumberingAfterBreak="0">
+  <w:abstractNum w:abstractNumId="2" w15:restartNumberingAfterBreak="0">
     <w:nsid w:val="6D5114D2"/>
     <w:multiLevelType w:val="hybridMultilevel"/>
     <w:tmpl w:val="5ECAD110"/>
@@ -1466,12 +1645,15 @@
     </w:lvl>
   </w:abstractNum>
   <w:num w:numId="1" w16cid:durableId="395202779">
-    <w:abstractNumId w:val="1"/>
+    <w:abstractNumId w:val="2"/>
     <w:lvlOverride w:ilvl="0">
       <w:startOverride w:val="1"/>
     </w:lvlOverride>
   </w:num>
   <w:num w:numId="2" w16cid:durableId="1043409896">
+    <w:abstractNumId w:val="1"/>
+  </w:num>
+  <w:num w:numId="3" w16cid:durableId="2140881961">
     <w:abstractNumId w:val="0"/>
   </w:num>
 </w:numbering>
@@ -1958,6 +2140,7 @@
   <w:style w:type="character" w:default="1" w:styleId="DefaultParagraphFont">
     <w:name w:val="Default Paragraph Font"/>
     <w:uiPriority w:val="1"/>
+    <w:semiHidden/>
     <w:unhideWhenUsed/>
   </w:style>
   <w:style w:type="table" w:default="1" w:styleId="TableNormal">

</xml_diff>

<commit_message>
docs: update resume files
</commit_message>
<xml_diff>
--- a/assets/resume/Martinus_Alvin_Haryanto_Resume.docx
+++ b/assets/resume/Martinus_Alvin_Haryanto_Resume.docx
@@ -27,7 +27,6 @@
           <w:szCs w:val="18"/>
         </w:rPr>
       </w:pPr>
-      <w:proofErr w:type="gramStart"/>
       <w:r>
         <w:rPr>
           <w:sz w:val="18"/>
@@ -35,7 +34,6 @@
         </w:rPr>
         <w:t>martinus.haryanto@binus.ac.id  |</w:t>
       </w:r>
-      <w:proofErr w:type="gramEnd"/>
       <w:r>
         <w:rPr>
           <w:sz w:val="18"/>
@@ -48,15 +46,14 @@
           <w:sz w:val="18"/>
           <w:szCs w:val="18"/>
         </w:rPr>
-        <w:t xml:space="preserve">+62 882 3900 </w:t>
-      </w:r>
-      <w:proofErr w:type="gramStart"/>
+        <w:t>+62 882 3900 3390</w:t>
+      </w:r>
       <w:r>
         <w:rPr>
           <w:sz w:val="18"/>
           <w:szCs w:val="18"/>
         </w:rPr>
-        <w:t>3390</w:t>
+        <w:t xml:space="preserve"> </w:t>
       </w:r>
       <w:r>
         <w:rPr>
@@ -70,22 +67,7 @@
           <w:sz w:val="18"/>
           <w:szCs w:val="18"/>
         </w:rPr>
-        <w:t xml:space="preserve"> </w:t>
-      </w:r>
-      <w:r>
-        <w:rPr>
-          <w:sz w:val="18"/>
-          <w:szCs w:val="18"/>
-        </w:rPr>
-        <w:t>|</w:t>
-      </w:r>
-      <w:proofErr w:type="gramEnd"/>
-      <w:r>
-        <w:rPr>
-          <w:sz w:val="18"/>
-          <w:szCs w:val="18"/>
-        </w:rPr>
-        <w:t xml:space="preserve"> </w:t>
+        <w:t xml:space="preserve">| </w:t>
       </w:r>
       <w:hyperlink r:id="rId5" w:history="1">
         <w:r>
@@ -94,7 +76,69 @@
             <w:sz w:val="18"/>
             <w:szCs w:val="18"/>
           </w:rPr>
-          <w:t xml:space="preserve">Martinus Alvin Haryanto </w:t>
+          <w:t>martinus-alvin-haryanto.vercel.app/</w:t>
+        </w:r>
+      </w:hyperlink>
+      <w:r>
+        <w:rPr>
+          <w:sz w:val="18"/>
+          <w:szCs w:val="18"/>
+        </w:rPr>
+        <w:t xml:space="preserve"> </w:t>
+      </w:r>
+      <w:r>
+        <w:rPr>
+          <w:sz w:val="18"/>
+          <w:szCs w:val="18"/>
+        </w:rPr>
+        <w:t>|</w:t>
+      </w:r>
+      <w:r>
+        <w:rPr>
+          <w:sz w:val="18"/>
+          <w:szCs w:val="18"/>
+        </w:rPr>
+        <w:t xml:space="preserve"> </w:t>
+      </w:r>
+      <w:hyperlink r:id="rId6" w:history="1">
+        <w:r>
+          <w:rPr>
+            <w:rStyle w:val="Hyperlink"/>
+            <w:sz w:val="18"/>
+            <w:szCs w:val="18"/>
+          </w:rPr>
+          <w:t>github.com/Alvin0628</w:t>
+        </w:r>
+      </w:hyperlink>
+      <w:r>
+        <w:rPr>
+          <w:sz w:val="18"/>
+          <w:szCs w:val="18"/>
+        </w:rPr>
+        <w:t xml:space="preserve"> </w:t>
+      </w:r>
+      <w:r>
+        <w:rPr>
+          <w:sz w:val="18"/>
+          <w:szCs w:val="18"/>
+        </w:rPr>
+        <w:t>|</w:t>
+      </w:r>
+      <w:r>
+        <w:rPr>
+          <w:sz w:val="18"/>
+          <w:szCs w:val="18"/>
+        </w:rPr>
+        <w:t xml:space="preserve"> </w:t>
+      </w:r>
+      <w:hyperlink r:id="rId7" w:history="1">
+        <w:r>
+          <w:rPr>
+            <w:rStyle w:val="Hyperlink"/>
+            <w:sz w:val="18"/>
+            <w:szCs w:val="18"/>
+          </w:rPr>
+          <w:t>linkedin.com/in/</w:t>
         </w:r>
         <w:proofErr w:type="spellStart"/>
         <w:r>
@@ -103,42 +147,17 @@
             <w:sz w:val="18"/>
             <w:szCs w:val="18"/>
           </w:rPr>
-          <w:t>Portofolio</w:t>
+          <w:t>martinus-alvin-haryanto</w:t>
         </w:r>
         <w:proofErr w:type="spellEnd"/>
-      </w:hyperlink>
-      <w:r>
-        <w:rPr>
-          <w:sz w:val="18"/>
-          <w:szCs w:val="18"/>
-        </w:rPr>
-        <w:t xml:space="preserve"> </w:t>
-      </w:r>
-      <w:r>
-        <w:rPr>
-          <w:sz w:val="18"/>
-          <w:szCs w:val="18"/>
-        </w:rPr>
-        <w:t xml:space="preserve">| </w:t>
-      </w:r>
-      <w:r>
-        <w:rPr>
-          <w:sz w:val="18"/>
-          <w:szCs w:val="18"/>
-        </w:rPr>
-        <w:t xml:space="preserve"> </w:t>
-      </w:r>
-      <w:hyperlink r:id="rId6" w:history="1">
-        <w:proofErr w:type="spellStart"/>
         <w:r>
           <w:rPr>
             <w:rStyle w:val="Hyperlink"/>
             <w:sz w:val="18"/>
             <w:szCs w:val="18"/>
           </w:rPr>
-          <w:t>Github</w:t>
+          <w:t>/</w:t>
         </w:r>
-        <w:proofErr w:type="spellEnd"/>
       </w:hyperlink>
       <w:r>
         <w:rPr>
@@ -152,52 +171,35 @@
           <w:sz w:val="18"/>
           <w:szCs w:val="18"/>
         </w:rPr>
-        <w:t>|</w:t>
+        <w:fldChar w:fldCharType="begin"/>
       </w:r>
       <w:r>
         <w:rPr>
           <w:sz w:val="18"/>
           <w:szCs w:val="18"/>
         </w:rPr>
-        <w:t xml:space="preserve">  </w:t>
+        <w:instrText>HYPERLINK "https://www.linkedin.com/in/martinus-alvin-haryanto/"</w:instrText>
       </w:r>
       <w:r>
         <w:rPr>
           <w:sz w:val="18"/>
           <w:szCs w:val="18"/>
         </w:rPr>
-        <w:fldChar w:fldCharType="begin"/>
       </w:r>
       <w:r>
         <w:rPr>
           <w:sz w:val="18"/>
           <w:szCs w:val="18"/>
         </w:rPr>
-        <w:instrText>HYPERLINK "https://www.linkedin.com/in/martinus-alvin-haryanto/"</w:instrText>
+        <w:fldChar w:fldCharType="separate"/>
       </w:r>
       <w:r>
         <w:rPr>
           <w:sz w:val="18"/>
           <w:szCs w:val="18"/>
         </w:rPr>
-      </w:r>
-      <w:r>
-        <w:rPr>
-          <w:sz w:val="18"/>
-          <w:szCs w:val="18"/>
-        </w:rPr>
-        <w:fldChar w:fldCharType="separate"/>
-      </w:r>
-      <w:proofErr w:type="spellStart"/>
-      <w:r>
-        <w:rPr>
-          <w:rStyle w:val="Hyperlink"/>
-          <w:sz w:val="18"/>
-          <w:szCs w:val="18"/>
-        </w:rPr>
-        <w:t>Linkedin</w:t>
-      </w:r>
-      <w:proofErr w:type="spellEnd"/>
+        <w:t xml:space="preserve"> </w:t>
+      </w:r>
     </w:p>
     <w:p>
       <w:pPr>
@@ -260,7 +262,14 @@
           <w:i/>
           <w:iCs/>
         </w:rPr>
-        <w:t>B.S. in Computer Science, Data Science Specialization Track</w:t>
+        <w:t>B.S. Computer Science, Data Science Specialization</w:t>
+      </w:r>
+      <w:r>
+        <w:rPr>
+          <w:i/>
+          <w:iCs/>
+        </w:rPr>
+        <w:t xml:space="preserve"> Track</w:t>
       </w:r>
       <w:r>
         <w:tab/>
@@ -388,7 +397,7 @@
         </w:rPr>
         <w:t xml:space="preserve"> | </w:t>
       </w:r>
-      <w:hyperlink r:id="rId7" w:history="1">
+      <w:hyperlink r:id="rId8" w:history="1">
         <w:r>
           <w:rPr>
             <w:rStyle w:val="Hyperlink"/>
@@ -555,7 +564,7 @@
         <w:ind w:left="288" w:hanging="215"/>
       </w:pPr>
       <w:r>
-        <w:t>Coordinated event planning and served as the Event Coordinator for faculty programs under the School of Computer Science (TECHNO, SESVENT, and FEAST 2025), managing end-to-end logistics and execution.</w:t>
+        <w:t>Coordinated end-to-end logistics for three School of Computer Science faculty programs, including TECHNO, SESVENT, and FEAST 2025, by aligning event teams, schedules, and execution requirements.</w:t>
       </w:r>
     </w:p>
     <w:p>
@@ -733,7 +742,6 @@
         </w:rPr>
         <w:tab/>
       </w:r>
-      <w:proofErr w:type="gramStart"/>
       <w:r>
         <w:rPr>
           <w:b/>
@@ -748,13 +756,6 @@
           <w:bCs/>
         </w:rPr>
         <w:tab/>
-      </w:r>
-      <w:proofErr w:type="gramEnd"/>
-      <w:r>
-        <w:rPr>
-          <w:b/>
-          <w:bCs/>
-        </w:rPr>
         <w:t xml:space="preserve">     </w:t>
       </w:r>
       <w:r>
@@ -776,10 +777,7 @@
         <w:ind w:left="288" w:hanging="215"/>
       </w:pPr>
       <w:r>
-        <w:t>Led orientation sessions and team-building activities during the Freshmen Year Program (FYP) to accelerate student campus integration</w:t>
-      </w:r>
-      <w:r>
-        <w:t>.</w:t>
+        <w:t>Led orientation sessions and team-building activities for 40–50 freshmen during the Freshmen Year Program, coordinating facilitators and supporting a smooth transition into campus life.</w:t>
       </w:r>
     </w:p>
     <w:p>
@@ -846,7 +844,7 @@
       <w:pPr>
         <w:spacing w:after="20"/>
       </w:pPr>
-      <w:hyperlink r:id="rId8" w:history="1">
+      <w:hyperlink r:id="rId9" w:history="1">
         <w:r>
           <w:rPr>
             <w:rStyle w:val="Hyperlink"/>
@@ -857,7 +855,7 @@
       <w:r>
         <w:t xml:space="preserve"> | </w:t>
       </w:r>
-      <w:hyperlink r:id="rId9" w:history="1">
+      <w:hyperlink r:id="rId10" w:history="1">
         <w:r>
           <w:rPr>
             <w:rStyle w:val="Hyperlink"/>
@@ -1051,21 +1049,14 @@
           <w:i/>
           <w:iCs/>
         </w:rPr>
-        <w:t>Sept</w:t>
-      </w:r>
-      <w:r>
-        <w:rPr>
-          <w:i/>
-          <w:iCs/>
-        </w:rPr>
-        <w:t xml:space="preserve"> 2026</w:t>
+        <w:t>Sept 2026</w:t>
       </w:r>
     </w:p>
     <w:p>
       <w:pPr>
         <w:spacing w:after="40"/>
       </w:pPr>
-      <w:hyperlink r:id="rId10" w:history="1">
+      <w:hyperlink r:id="rId11" w:history="1">
         <w:r>
           <w:rPr>
             <w:rStyle w:val="Hyperlink"/>
@@ -1076,7 +1067,7 @@
       <w:r>
         <w:t xml:space="preserve"> | </w:t>
       </w:r>
-      <w:hyperlink r:id="rId11" w:history="1">
+      <w:hyperlink r:id="rId12" w:history="1">
         <w:proofErr w:type="spellStart"/>
         <w:r>
           <w:rPr>
@@ -1112,15 +1103,7 @@
         <w:ind w:left="288" w:hanging="215"/>
       </w:pPr>
       <w:r>
-        <w:t xml:space="preserve">Automated a zero-downtime CI/CD pipeline using GitHub Actions and AWS ECR, ensuring seamless image building, registry syncing, and </w:t>
-      </w:r>
-      <w:proofErr w:type="gramStart"/>
-      <w:r>
-        <w:t>secure .env</w:t>
-      </w:r>
-      <w:proofErr w:type="gramEnd"/>
-      <w:r>
-        <w:t xml:space="preserve"> secret injection.</w:t>
+        <w:t>Automated a zero-downtime CI/CD pipeline using GitHub Actions and AWS ECR, ensuring seamless image building, registry syncing, and secure .env secret injection.</w:t>
       </w:r>
     </w:p>
     <w:p>
@@ -1178,41 +1161,36 @@
     </w:p>
     <w:p>
       <w:pPr>
-        <w:spacing w:after="14"/>
-      </w:pPr>
-      <w:r>
-        <w:rPr>
-          <w:b/>
-          <w:bCs/>
-        </w:rPr>
-        <w:t xml:space="preserve">Languages: </w:t>
-      </w:r>
-      <w:r>
-        <w:t>Python, SQL, C, Java, R, Dart</w:t>
-      </w:r>
-      <w:r>
-        <w:t xml:space="preserve"> (basic)</w:t>
-      </w:r>
-      <w:r>
-        <w:t>, JavaScript</w:t>
-      </w:r>
-      <w:r>
-        <w:t xml:space="preserve"> (basic)</w:t>
-      </w:r>
-    </w:p>
-    <w:p>
-      <w:pPr>
-        <w:spacing w:after="14"/>
-      </w:pPr>
-      <w:r>
-        <w:rPr>
-          <w:b/>
-          <w:bCs/>
-        </w:rPr>
-        <w:t>Data Engineering &amp; ETL:</w:t>
-      </w:r>
-      <w:r>
-        <w:t xml:space="preserve"> Apache Airflow, Medallion Architecture, </w:t>
+        <w:spacing w:after="20"/>
+        <w:rPr>
+          <w:b/>
+          <w:bCs/>
+        </w:rPr>
+      </w:pPr>
+      <w:r>
+        <w:rPr>
+          <w:b/>
+          <w:bCs/>
+        </w:rPr>
+        <w:t xml:space="preserve">Programming: </w:t>
+      </w:r>
+      <w:r>
+        <w:t>Python, SQL, Java, C, R</w:t>
+      </w:r>
+    </w:p>
+    <w:p>
+      <w:pPr>
+        <w:spacing w:after="20"/>
+      </w:pPr>
+      <w:r>
+        <w:rPr>
+          <w:b/>
+          <w:bCs/>
+        </w:rPr>
+        <w:t xml:space="preserve">Data Engineering: </w:t>
+      </w:r>
+      <w:r>
+        <w:t xml:space="preserve">Apache Airflow, </w:t>
       </w:r>
       <w:proofErr w:type="spellStart"/>
       <w:r>
@@ -1228,53 +1206,88 @@
       </w:r>
       <w:proofErr w:type="spellEnd"/>
       <w:r>
-        <w:t>, Pandas, NumPy</w:t>
+        <w:t>, Pandas, NumPy, Medallion Architecture</w:t>
       </w:r>
     </w:p>
     <w:p>
       <w:pPr>
         <w:spacing w:after="20"/>
-        <w:rPr>
-          <w:b/>
-          <w:bCs/>
-        </w:rPr>
-      </w:pPr>
-      <w:r>
-        <w:rPr>
-          <w:b/>
-          <w:bCs/>
-        </w:rPr>
-        <w:t xml:space="preserve">Model Development &amp; Tuning: </w:t>
+      </w:pPr>
+      <w:r>
+        <w:rPr>
+          <w:b/>
+          <w:bCs/>
+        </w:rPr>
+        <w:t>Machine Learning &amp; Deep Learning:</w:t>
+      </w:r>
+      <w:r>
+        <w:t xml:space="preserve"> Scikit-Learn, </w:t>
       </w:r>
       <w:proofErr w:type="spellStart"/>
       <w:r>
+        <w:t>XGBoost</w:t>
+      </w:r>
+      <w:proofErr w:type="spellEnd"/>
+      <w:r>
+        <w:t xml:space="preserve">, </w:t>
+      </w:r>
+      <w:proofErr w:type="spellStart"/>
+      <w:r>
+        <w:t>LightGBM</w:t>
+      </w:r>
+      <w:proofErr w:type="spellEnd"/>
+      <w:r>
+        <w:t xml:space="preserve">, </w:t>
+      </w:r>
+      <w:proofErr w:type="spellStart"/>
+      <w:r>
         <w:t>PyTorch</w:t>
       </w:r>
       <w:proofErr w:type="spellEnd"/>
       <w:r>
-        <w:t xml:space="preserve">, Scikit-Learn, </w:t>
+        <w:t xml:space="preserve">, Computer Vision (YOLOv11, Grounding DINO), NLP (BERT), </w:t>
       </w:r>
       <w:proofErr w:type="spellStart"/>
       <w:r>
-        <w:t>XGBoost</w:t>
+        <w:t>Optuna</w:t>
       </w:r>
       <w:proofErr w:type="spellEnd"/>
-      <w:r>
-        <w:t xml:space="preserve">, </w:t>
-      </w:r>
+    </w:p>
+    <w:p>
+      <w:pPr>
+        <w:spacing w:after="20"/>
+        <w:rPr>
+          <w:b/>
+          <w:bCs/>
+        </w:rPr>
+      </w:pPr>
       <w:proofErr w:type="spellStart"/>
       <w:r>
-        <w:t>LightGBM</w:t>
+        <w:rPr>
+          <w:b/>
+          <w:bCs/>
+        </w:rPr>
+        <w:t>MLOps</w:t>
       </w:r>
       <w:proofErr w:type="spellEnd"/>
       <w:r>
-        <w:t xml:space="preserve">, Computer Vision (YOLOv11, Grounding DINO), NLP (BERT), </w:t>
+        <w:rPr>
+          <w:b/>
+          <w:bCs/>
+        </w:rPr>
+        <w:t xml:space="preserve"> &amp; Cloud: </w:t>
+      </w:r>
+      <w:r>
+        <w:t xml:space="preserve">Docker, GitHub Actions, CI/CD, Continuous Training Pipelines, AWS, </w:t>
       </w:r>
       <w:proofErr w:type="spellStart"/>
       <w:r>
-        <w:t>Optuna</w:t>
+        <w:t>Vercel</w:t>
       </w:r>
       <w:proofErr w:type="spellEnd"/>
+      <w:r>
+        <w:t>, Firebase</w:t>
+      </w:r>
     </w:p>
     <w:p>
       <w:pPr>
@@ -1284,40 +1297,15 @@
           <w:bCs/>
         </w:rPr>
       </w:pPr>
-      <w:proofErr w:type="spellStart"/>
-      <w:r>
-        <w:rPr>
-          <w:b/>
-          <w:bCs/>
-        </w:rPr>
-        <w:t>MLOps</w:t>
-      </w:r>
-      <w:proofErr w:type="spellEnd"/>
-      <w:r>
-        <w:rPr>
-          <w:b/>
-          <w:bCs/>
-        </w:rPr>
-        <w:t xml:space="preserve">, Deployment &amp; Cloud: </w:t>
-      </w:r>
-      <w:r>
-        <w:t xml:space="preserve">Docker, Continuous Training Pipelines, GitHub Actions (CI/CD), AWS, Firebase, </w:t>
-      </w:r>
-      <w:proofErr w:type="spellStart"/>
-      <w:r>
-        <w:t>Supabase</w:t>
-      </w:r>
-      <w:proofErr w:type="spellEnd"/>
-      <w:r>
-        <w:t xml:space="preserve">, </w:t>
-      </w:r>
-      <w:proofErr w:type="spellStart"/>
-      <w:r>
-        <w:t>Vercel</w:t>
-      </w:r>
-      <w:proofErr w:type="spellEnd"/>
-      <w:r>
-        <w:t>, Git</w:t>
+      <w:r>
+        <w:rPr>
+          <w:b/>
+          <w:bCs/>
+        </w:rPr>
+        <w:t xml:space="preserve">Basic: </w:t>
+      </w:r>
+      <w:r>
+        <w:t>Dart, JavaScript</w:t>
       </w:r>
     </w:p>
     <w:sectPr>

</xml_diff>

<commit_message>
docs(resume): add YouTube Performance Predictor, condense projects and update tech stack
</commit_message>
<xml_diff>
--- a/assets/resume/Martinus_Alvin_Haryanto_Resume.docx
+++ b/assets/resume/Martinus_Alvin_Haryanto_Resume.docx
@@ -27,6 +27,7 @@
           <w:szCs w:val="18"/>
         </w:rPr>
       </w:pPr>
+      <w:proofErr w:type="gramStart"/>
       <w:r>
         <w:rPr>
           <w:sz w:val="18"/>
@@ -34,6 +35,7 @@
         </w:rPr>
         <w:t>martinus.haryanto@binus.ac.id  |</w:t>
       </w:r>
+      <w:proofErr w:type="gramEnd"/>
       <w:r>
         <w:rPr>
           <w:sz w:val="18"/>
@@ -46,14 +48,15 @@
           <w:sz w:val="18"/>
           <w:szCs w:val="18"/>
         </w:rPr>
-        <w:t>+62 882 3900 3390</w:t>
-      </w:r>
+        <w:t xml:space="preserve">+62 882 3900 </w:t>
+      </w:r>
+      <w:proofErr w:type="gramStart"/>
       <w:r>
         <w:rPr>
           <w:sz w:val="18"/>
           <w:szCs w:val="18"/>
         </w:rPr>
-        <w:t xml:space="preserve"> </w:t>
+        <w:t>3390</w:t>
       </w:r>
       <w:r>
         <w:rPr>
@@ -67,79 +70,24 @@
           <w:sz w:val="18"/>
           <w:szCs w:val="18"/>
         </w:rPr>
-        <w:t xml:space="preserve">| </w:t>
-      </w:r>
-      <w:hyperlink r:id="rId5" w:history="1">
-        <w:r>
-          <w:rPr>
-            <w:rStyle w:val="Hyperlink"/>
-            <w:sz w:val="18"/>
-            <w:szCs w:val="18"/>
-          </w:rPr>
-          <w:t>martinus-alvin-haryanto.vercel.app/</w:t>
-        </w:r>
-      </w:hyperlink>
+        <w:t xml:space="preserve"> </w:t>
+      </w:r>
       <w:r>
         <w:rPr>
           <w:sz w:val="18"/>
           <w:szCs w:val="18"/>
         </w:rPr>
-        <w:t xml:space="preserve"> </w:t>
-      </w:r>
+        <w:t>|</w:t>
+      </w:r>
+      <w:proofErr w:type="gramEnd"/>
       <w:r>
         <w:rPr>
           <w:sz w:val="18"/>
           <w:szCs w:val="18"/>
         </w:rPr>
-        <w:t>|</w:t>
-      </w:r>
-      <w:r>
-        <w:rPr>
-          <w:sz w:val="18"/>
-          <w:szCs w:val="18"/>
-        </w:rPr>
         <w:t xml:space="preserve"> </w:t>
       </w:r>
-      <w:hyperlink r:id="rId6" w:history="1">
-        <w:r>
-          <w:rPr>
-            <w:rStyle w:val="Hyperlink"/>
-            <w:sz w:val="18"/>
-            <w:szCs w:val="18"/>
-          </w:rPr>
-          <w:t>github.com/Alvin0628</w:t>
-        </w:r>
-      </w:hyperlink>
-      <w:r>
-        <w:rPr>
-          <w:sz w:val="18"/>
-          <w:szCs w:val="18"/>
-        </w:rPr>
-        <w:t xml:space="preserve"> </w:t>
-      </w:r>
-      <w:r>
-        <w:rPr>
-          <w:sz w:val="18"/>
-          <w:szCs w:val="18"/>
-        </w:rPr>
-        <w:t>|</w:t>
-      </w:r>
-      <w:r>
-        <w:rPr>
-          <w:sz w:val="18"/>
-          <w:szCs w:val="18"/>
-        </w:rPr>
-        <w:t xml:space="preserve"> </w:t>
-      </w:r>
-      <w:hyperlink r:id="rId7" w:history="1">
-        <w:r>
-          <w:rPr>
-            <w:rStyle w:val="Hyperlink"/>
-            <w:sz w:val="18"/>
-            <w:szCs w:val="18"/>
-          </w:rPr>
-          <w:t>linkedin.com/in/</w:t>
-        </w:r>
+      <w:hyperlink r:id="rId5" w:history="1">
         <w:proofErr w:type="spellStart"/>
         <w:r>
           <w:rPr>
@@ -147,17 +95,75 @@
             <w:sz w:val="18"/>
             <w:szCs w:val="18"/>
           </w:rPr>
-          <w:t>martinus-alvin-haryanto</w:t>
+          <w:t>Portofolio</w:t>
         </w:r>
         <w:proofErr w:type="spellEnd"/>
+      </w:hyperlink>
+      <w:r>
+        <w:rPr>
+          <w:sz w:val="18"/>
+          <w:szCs w:val="18"/>
+        </w:rPr>
+        <w:t xml:space="preserve"> </w:t>
+      </w:r>
+      <w:r>
+        <w:rPr>
+          <w:sz w:val="18"/>
+          <w:szCs w:val="18"/>
+        </w:rPr>
+        <w:t>|</w:t>
+      </w:r>
+      <w:r>
+        <w:rPr>
+          <w:sz w:val="18"/>
+          <w:szCs w:val="18"/>
+        </w:rPr>
+        <w:t xml:space="preserve"> </w:t>
+      </w:r>
+      <w:hyperlink r:id="rId6" w:history="1">
+        <w:proofErr w:type="spellStart"/>
         <w:r>
           <w:rPr>
             <w:rStyle w:val="Hyperlink"/>
             <w:sz w:val="18"/>
             <w:szCs w:val="18"/>
           </w:rPr>
-          <w:t>/</w:t>
+          <w:t>Github</w:t>
         </w:r>
+        <w:proofErr w:type="spellEnd"/>
+      </w:hyperlink>
+      <w:r>
+        <w:rPr>
+          <w:sz w:val="18"/>
+          <w:szCs w:val="18"/>
+        </w:rPr>
+        <w:t xml:space="preserve"> </w:t>
+      </w:r>
+      <w:r>
+        <w:rPr>
+          <w:sz w:val="18"/>
+          <w:szCs w:val="18"/>
+        </w:rPr>
+        <w:t>|</w:t>
+      </w:r>
+      <w:r>
+        <w:rPr>
+          <w:sz w:val="18"/>
+          <w:szCs w:val="18"/>
+        </w:rPr>
+        <w:t xml:space="preserve"> </w:t>
+      </w:r>
+      <w:hyperlink r:id="rId7" w:history="1">
+        <w:proofErr w:type="spellStart"/>
+        <w:r>
+          <w:rPr>
+            <w:rStyle w:val="Hyperlink"/>
+            <w:sz w:val="18"/>
+            <w:szCs w:val="18"/>
+          </w:rPr>
+          <w:t>Linkedin</w:t>
+        </w:r>
+        <w:proofErr w:type="spellEnd"/>
       </w:hyperlink>
       <w:r>
         <w:rPr>
@@ -427,7 +433,7 @@
         <w:ind w:left="288" w:hanging="215"/>
       </w:pPr>
       <w:r>
-        <w:t xml:space="preserve">Architected and led the development of a dynamic classifier selection (DCS-LCA) framework, implementing KNN-based overlap cleaning and expert selection across heterogeneous models (Naive Bayes, </w:t>
+        <w:t xml:space="preserve">Led development of DCS-LCA, a dynamic classifier selection framework combining KNN overlap cleaning with expert selection across Naive Bayes, </w:t>
       </w:r>
       <w:proofErr w:type="spellStart"/>
       <w:r>
@@ -435,7 +441,114 @@
       </w:r>
       <w:proofErr w:type="spellEnd"/>
       <w:r>
-        <w:t>, SVM).</w:t>
+        <w:t xml:space="preserve">, and SVM, and authored the manuscript; cut log loss by 70.1% (0.898 to 0.269) versus a baseline </w:t>
+      </w:r>
+      <w:r>
+        <w:t xml:space="preserve">probability harvesting </w:t>
+      </w:r>
+      <w:r>
+        <w:t xml:space="preserve">and reached 91.62% accuracy (macro F1 0.8638) on the </w:t>
+      </w:r>
+      <w:r>
+        <w:t>datasets.</w:t>
+      </w:r>
+    </w:p>
+    <w:p>
+      <w:pPr>
+        <w:keepNext/>
+        <w:pBdr>
+          <w:bottom w:val="single" w:sz="4" w:space="2" w:color="000000"/>
+        </w:pBdr>
+        <w:spacing w:before="160" w:after="60"/>
+      </w:pPr>
+      <w:r>
+        <w:rPr>
+          <w:b/>
+          <w:bCs/>
+          <w:caps/>
+        </w:rPr>
+        <w:t>ORGANIZATIONS</w:t>
+      </w:r>
+    </w:p>
+    <w:p>
+      <w:pPr>
+        <w:tabs>
+          <w:tab w:val="right" w:pos="10080"/>
+        </w:tabs>
+        <w:spacing w:after="20"/>
+        <w:rPr>
+          <w:b/>
+          <w:bCs/>
+        </w:rPr>
+      </w:pPr>
+      <w:proofErr w:type="spellStart"/>
+      <w:r>
+        <w:rPr>
+          <w:b/>
+          <w:bCs/>
+        </w:rPr>
+        <w:t>Himpunan</w:t>
+      </w:r>
+      <w:proofErr w:type="spellEnd"/>
+      <w:r>
+        <w:rPr>
+          <w:b/>
+          <w:bCs/>
+        </w:rPr>
+        <w:t xml:space="preserve"> </w:t>
+      </w:r>
+      <w:proofErr w:type="spellStart"/>
+      <w:r>
+        <w:rPr>
+          <w:b/>
+          <w:bCs/>
+        </w:rPr>
+        <w:t>Mahasiswa</w:t>
+      </w:r>
+      <w:proofErr w:type="spellEnd"/>
+      <w:r>
+        <w:rPr>
+          <w:b/>
+          <w:bCs/>
+        </w:rPr>
+        <w:t xml:space="preserve"> Teknik </w:t>
+      </w:r>
+      <w:proofErr w:type="spellStart"/>
+      <w:r>
+        <w:rPr>
+          <w:b/>
+          <w:bCs/>
+        </w:rPr>
+        <w:t>Informatika</w:t>
+      </w:r>
+      <w:proofErr w:type="spellEnd"/>
+      <w:r>
+        <w:rPr>
+          <w:b/>
+          <w:bCs/>
+        </w:rPr>
+        <w:t xml:space="preserve"> (HIMTI) BINUS University</w:t>
+      </w:r>
+    </w:p>
+    <w:p>
+      <w:pPr>
+        <w:tabs>
+          <w:tab w:val="right" w:pos="10080"/>
+        </w:tabs>
+        <w:spacing w:after="20"/>
+      </w:pPr>
+      <w:r>
+        <w:t>Activist in Publication and Marketing</w:t>
+      </w:r>
+      <w:r>
+        <w:tab/>
+      </w:r>
+      <w:r>
+        <w:rPr>
+          <w:i/>
+          <w:iCs/>
+        </w:rPr>
+        <w:t>Oct 2024 – Oct 2025</w:t>
       </w:r>
     </w:p>
     <w:p>
@@ -449,108 +562,101 @@
         <w:ind w:left="288" w:hanging="215"/>
       </w:pPr>
       <w:r>
-        <w:t xml:space="preserve">Lead </w:t>
-      </w:r>
-      <w:r>
-        <w:t>the model evaluation and authored the primary manuscript, cutting log loss by 70.1% (0.898 to 0.269) versus a baseline and achieving 91.62% accuracy (macro F1: 0.8638) on the UCI Student Dropout dataset (n=4,424).</w:t>
-      </w:r>
-    </w:p>
-    <w:p>
-      <w:pPr>
-        <w:keepNext/>
-        <w:pBdr>
-          <w:bottom w:val="single" w:sz="4" w:space="2" w:color="000000"/>
-        </w:pBdr>
-        <w:spacing w:before="160" w:after="60"/>
-      </w:pPr>
-      <w:r>
-        <w:rPr>
-          <w:b/>
-          <w:bCs/>
-          <w:caps/>
-        </w:rPr>
-        <w:t>ORGANIZATIONS</w:t>
-      </w:r>
-    </w:p>
-    <w:p>
-      <w:pPr>
-        <w:tabs>
-          <w:tab w:val="right" w:pos="10080"/>
-        </w:tabs>
-        <w:spacing w:after="20"/>
-        <w:rPr>
-          <w:b/>
-          <w:bCs/>
-        </w:rPr>
-      </w:pPr>
-      <w:proofErr w:type="spellStart"/>
-      <w:r>
-        <w:rPr>
-          <w:b/>
-          <w:bCs/>
-        </w:rPr>
-        <w:t>Himpunan</w:t>
-      </w:r>
-      <w:proofErr w:type="spellEnd"/>
-      <w:r>
-        <w:rPr>
-          <w:b/>
-          <w:bCs/>
-        </w:rPr>
-        <w:t xml:space="preserve"> </w:t>
-      </w:r>
-      <w:proofErr w:type="spellStart"/>
-      <w:r>
-        <w:rPr>
-          <w:b/>
-          <w:bCs/>
-        </w:rPr>
-        <w:t>Mahasiswa</w:t>
-      </w:r>
-      <w:proofErr w:type="spellEnd"/>
-      <w:r>
-        <w:rPr>
-          <w:b/>
-          <w:bCs/>
-        </w:rPr>
-        <w:t xml:space="preserve"> Teknik </w:t>
-      </w:r>
-      <w:proofErr w:type="spellStart"/>
-      <w:r>
-        <w:rPr>
-          <w:b/>
-          <w:bCs/>
-        </w:rPr>
-        <w:t>Informatika</w:t>
-      </w:r>
-      <w:proofErr w:type="spellEnd"/>
-      <w:r>
-        <w:rPr>
-          <w:b/>
-          <w:bCs/>
-        </w:rPr>
-        <w:t xml:space="preserve"> (HIMTI) BINUS University</w:t>
-      </w:r>
-    </w:p>
-    <w:p>
-      <w:pPr>
-        <w:tabs>
-          <w:tab w:val="right" w:pos="10080"/>
-        </w:tabs>
-        <w:spacing w:after="20"/>
-      </w:pPr>
-      <w:r>
-        <w:t>Activist in Publication and Marketing</w:t>
-      </w:r>
-      <w:r>
-        <w:tab/>
+        <w:t>Coordinated end-to-end logistics for three School of Computer Science programs (TECHNO, SESVENT, FEAST 2025), aligning event teams, schedules, and execution requirements.</w:t>
+      </w:r>
+    </w:p>
+    <w:p>
+      <w:pPr>
+        <w:spacing w:after="40"/>
+        <w:rPr>
+          <w:b/>
+          <w:bCs/>
+        </w:rPr>
+      </w:pPr>
+      <w:r>
+        <w:rPr>
+          <w:b/>
+          <w:bCs/>
+        </w:rPr>
+        <w:t>Freshmen Partner</w:t>
+      </w:r>
+      <w:r>
+        <w:rPr>
+          <w:b/>
+          <w:bCs/>
+        </w:rPr>
+        <w:t xml:space="preserve"> and Freshmen Leader</w:t>
       </w:r>
       <w:r>
         <w:rPr>
           <w:i/>
           <w:iCs/>
         </w:rPr>
-        <w:t>Oct 2024 – Oct 2025</w:t>
+        <w:t xml:space="preserve"> </w:t>
+      </w:r>
+      <w:r>
+        <w:rPr>
+          <w:i/>
+          <w:iCs/>
+        </w:rPr>
+        <w:tab/>
+      </w:r>
+      <w:r>
+        <w:rPr>
+          <w:i/>
+          <w:iCs/>
+        </w:rPr>
+        <w:tab/>
+      </w:r>
+      <w:r>
+        <w:rPr>
+          <w:i/>
+          <w:iCs/>
+        </w:rPr>
+        <w:tab/>
+      </w:r>
+      <w:r>
+        <w:rPr>
+          <w:i/>
+          <w:iCs/>
+        </w:rPr>
+        <w:tab/>
+      </w:r>
+      <w:r>
+        <w:rPr>
+          <w:i/>
+          <w:iCs/>
+        </w:rPr>
+        <w:tab/>
+      </w:r>
+      <w:r>
+        <w:rPr>
+          <w:i/>
+          <w:iCs/>
+        </w:rPr>
+        <w:tab/>
+      </w:r>
+      <w:r>
+        <w:rPr>
+          <w:i/>
+          <w:iCs/>
+        </w:rPr>
+        <w:tab/>
+        <w:t>Sept</w:t>
+      </w:r>
+      <w:r>
+        <w:rPr>
+          <w:i/>
+          <w:iCs/>
+        </w:rPr>
+        <w:t xml:space="preserve"> </w:t>
+      </w:r>
+      <w:r>
+        <w:rPr>
+          <w:i/>
+          <w:iCs/>
+        </w:rPr>
+        <w:t>2025 – Sept 2026</w:t>
       </w:r>
     </w:p>
     <w:p>
@@ -564,220 +670,7 @@
         <w:ind w:left="288" w:hanging="215"/>
       </w:pPr>
       <w:r>
-        <w:t>Coordinated end-to-end logistics for three School of Computer Science faculty programs, including TECHNO, SESVENT, and FEAST 2025, by aligning event teams, schedules, and execution requirements.</w:t>
-      </w:r>
-    </w:p>
-    <w:p>
-      <w:pPr>
-        <w:spacing w:after="40"/>
-        <w:rPr>
-          <w:b/>
-          <w:bCs/>
-        </w:rPr>
-      </w:pPr>
-      <w:r>
-        <w:rPr>
-          <w:b/>
-          <w:bCs/>
-        </w:rPr>
-        <w:t>Freshmen Partner</w:t>
-      </w:r>
-      <w:r>
-        <w:rPr>
-          <w:i/>
-          <w:iCs/>
-        </w:rPr>
-        <w:t xml:space="preserve"> </w:t>
-      </w:r>
-      <w:r>
-        <w:rPr>
-          <w:i/>
-          <w:iCs/>
-        </w:rPr>
-        <w:tab/>
-      </w:r>
-      <w:r>
-        <w:rPr>
-          <w:i/>
-          <w:iCs/>
-        </w:rPr>
-        <w:tab/>
-      </w:r>
-      <w:r>
-        <w:rPr>
-          <w:i/>
-          <w:iCs/>
-        </w:rPr>
-        <w:tab/>
-      </w:r>
-      <w:r>
-        <w:rPr>
-          <w:i/>
-          <w:iCs/>
-        </w:rPr>
-        <w:tab/>
-      </w:r>
-      <w:r>
-        <w:rPr>
-          <w:i/>
-          <w:iCs/>
-        </w:rPr>
-        <w:tab/>
-      </w:r>
-      <w:r>
-        <w:rPr>
-          <w:i/>
-          <w:iCs/>
-        </w:rPr>
-        <w:tab/>
-      </w:r>
-      <w:r>
-        <w:rPr>
-          <w:i/>
-          <w:iCs/>
-        </w:rPr>
-        <w:tab/>
-      </w:r>
-      <w:r>
-        <w:rPr>
-          <w:i/>
-          <w:iCs/>
-        </w:rPr>
-        <w:tab/>
-      </w:r>
-      <w:r>
-        <w:rPr>
-          <w:i/>
-          <w:iCs/>
-        </w:rPr>
-        <w:tab/>
-        <w:t>Sept 2025 – Sept 2026</w:t>
-      </w:r>
-    </w:p>
-    <w:p>
-      <w:pPr>
-        <w:pStyle w:val="ListParagraph"/>
-        <w:numPr>
-          <w:ilvl w:val="0"/>
-          <w:numId w:val="1"/>
-        </w:numPr>
-        <w:spacing w:after="40"/>
-        <w:ind w:left="288" w:hanging="215"/>
-      </w:pPr>
-      <w:r>
-        <w:t>Mentored first-year students to adapt to academic culture, guiding them through campus systems</w:t>
-      </w:r>
-      <w:r>
-        <w:t>.</w:t>
-      </w:r>
-    </w:p>
-    <w:p>
-      <w:pPr>
-        <w:spacing w:after="40"/>
-        <w:rPr>
-          <w:b/>
-          <w:bCs/>
-        </w:rPr>
-      </w:pPr>
-      <w:r>
-        <w:rPr>
-          <w:b/>
-          <w:bCs/>
-        </w:rPr>
-        <w:t>Freshmen Leader</w:t>
-      </w:r>
-      <w:r>
-        <w:rPr>
-          <w:b/>
-          <w:bCs/>
-        </w:rPr>
-        <w:tab/>
-      </w:r>
-      <w:r>
-        <w:rPr>
-          <w:b/>
-          <w:bCs/>
-        </w:rPr>
-        <w:tab/>
-      </w:r>
-      <w:r>
-        <w:rPr>
-          <w:b/>
-          <w:bCs/>
-        </w:rPr>
-        <w:tab/>
-      </w:r>
-      <w:r>
-        <w:rPr>
-          <w:b/>
-          <w:bCs/>
-        </w:rPr>
-        <w:tab/>
-      </w:r>
-      <w:r>
-        <w:rPr>
-          <w:b/>
-          <w:bCs/>
-        </w:rPr>
-        <w:tab/>
-      </w:r>
-      <w:r>
-        <w:rPr>
-          <w:b/>
-          <w:bCs/>
-        </w:rPr>
-        <w:tab/>
-      </w:r>
-      <w:r>
-        <w:rPr>
-          <w:b/>
-          <w:bCs/>
-        </w:rPr>
-        <w:tab/>
-      </w:r>
-      <w:r>
-        <w:rPr>
-          <w:b/>
-          <w:bCs/>
-        </w:rPr>
-        <w:tab/>
-      </w:r>
-      <w:r>
-        <w:rPr>
-          <w:b/>
-          <w:bCs/>
-        </w:rPr>
-        <w:tab/>
-        <w:t xml:space="preserve">  </w:t>
-      </w:r>
-      <w:r>
-        <w:rPr>
-          <w:b/>
-          <w:bCs/>
-        </w:rPr>
-        <w:tab/>
-        <w:t xml:space="preserve">     </w:t>
-      </w:r>
-      <w:r>
-        <w:rPr>
-          <w:i/>
-          <w:iCs/>
-        </w:rPr>
-        <w:t>Sept 2025</w:t>
-      </w:r>
-    </w:p>
-    <w:p>
-      <w:pPr>
-        <w:pStyle w:val="ListParagraph"/>
-        <w:numPr>
-          <w:ilvl w:val="0"/>
-          <w:numId w:val="1"/>
-        </w:numPr>
-        <w:spacing w:after="40"/>
-        <w:ind w:left="288" w:hanging="215"/>
-      </w:pPr>
-      <w:r>
-        <w:t>Led orientation sessions and team-building activities for 40–50 freshmen during the Freshmen Year Program, coordinating facilitators and supporting a smooth transition into campus life.</w:t>
+        <w:t>Led orientation and team-building sessions for 40–50 freshmen in the Freshmen Year Program, coordinating facilitators and mentoring them through campus systems and academic culture.</w:t>
       </w:r>
     </w:p>
     <w:p>
@@ -875,15 +768,31 @@
         <w:ind w:left="288" w:hanging="215"/>
       </w:pPr>
       <w:r>
-        <w:t xml:space="preserve">Built a monthly-batch medallion warehouse (Raw → Silver → Gold) on PostgreSQL, transforming 7 source tables into </w:t>
-      </w:r>
-      <w:proofErr w:type="spellStart"/>
-      <w:r>
-        <w:t>dbt-modeled</w:t>
-      </w:r>
-      <w:proofErr w:type="spellEnd"/>
-      <w:r>
-        <w:t xml:space="preserve"> marts for sales, logistics SLA, and user funnel analytics.</w:t>
+        <w:t xml:space="preserve">Built a medallion warehouse (Raw → Silver → Gold) on PostgreSQL with </w:t>
+      </w:r>
+      <w:proofErr w:type="spellStart"/>
+      <w:r>
+        <w:t>dbt</w:t>
+      </w:r>
+      <w:proofErr w:type="spellEnd"/>
+      <w:r>
+        <w:t xml:space="preserve"> marts for sales, logistics SLA, and user funnels, orchestrated by a 6-DAG Airflow pipeline (load → </w:t>
+      </w:r>
+      <w:proofErr w:type="spellStart"/>
+      <w:r>
+        <w:t>dbt</w:t>
+      </w:r>
+      <w:proofErr w:type="spellEnd"/>
+      <w:r>
+        <w:t xml:space="preserve"> → </w:t>
+      </w:r>
+      <w:proofErr w:type="spellStart"/>
+      <w:r>
+        <w:t>Supabase</w:t>
+      </w:r>
+      <w:proofErr w:type="spellEnd"/>
+      <w:r>
+        <w:t xml:space="preserve"> sync → ML train/inference) that gates retraining to every 6th batch.</w:t>
       </w:r>
     </w:p>
     <w:p>
@@ -897,15 +806,23 @@
         <w:ind w:left="288" w:hanging="215"/>
       </w:pPr>
       <w:r>
-        <w:t xml:space="preserve">Orchestrated a 6-DAG Airflow pipeline (load → </w:t>
-      </w:r>
-      <w:proofErr w:type="spellStart"/>
-      <w:r>
-        <w:t>dbt</w:t>
-      </w:r>
-      <w:proofErr w:type="spellEnd"/>
-      <w:r>
-        <w:t xml:space="preserve"> → </w:t>
+        <w:t xml:space="preserve">Trained </w:t>
+      </w:r>
+      <w:proofErr w:type="spellStart"/>
+      <w:r>
+        <w:t>Optuna</w:t>
+      </w:r>
+      <w:proofErr w:type="spellEnd"/>
+      <w:r>
+        <w:t xml:space="preserve">-tuned </w:t>
+      </w:r>
+      <w:proofErr w:type="spellStart"/>
+      <w:r>
+        <w:t>XGBoost</w:t>
+      </w:r>
+      <w:proofErr w:type="spellEnd"/>
+      <w:r>
+        <w:t xml:space="preserve"> churn and conversion models behind a champion/challenger registry that only promotes models beating both a baseline and the current champion, and shipped a Next.js + </w:t>
       </w:r>
       <w:proofErr w:type="spellStart"/>
       <w:r>
@@ -913,59 +830,7 @@
       </w:r>
       <w:proofErr w:type="spellEnd"/>
       <w:r>
-        <w:t xml:space="preserve"> sync → ML train/inference) via Docker-outside-of-Docker, gating retraining to every 6th batch instead of a fixed schedule.</w:t>
-      </w:r>
-    </w:p>
-    <w:p>
-      <w:pPr>
-        <w:pStyle w:val="ListParagraph"/>
-        <w:numPr>
-          <w:ilvl w:val="0"/>
-          <w:numId w:val="1"/>
-        </w:numPr>
-        <w:spacing w:after="40"/>
-        <w:ind w:left="288" w:hanging="215"/>
-      </w:pPr>
-      <w:r>
-        <w:t xml:space="preserve">Trained </w:t>
-      </w:r>
-      <w:proofErr w:type="spellStart"/>
-      <w:r>
-        <w:t>XGBoost</w:t>
-      </w:r>
-      <w:proofErr w:type="spellEnd"/>
-      <w:r>
-        <w:t xml:space="preserve"> churn and conversion models with </w:t>
-      </w:r>
-      <w:proofErr w:type="spellStart"/>
-      <w:r>
-        <w:t>Optuna</w:t>
-      </w:r>
-      <w:proofErr w:type="spellEnd"/>
-      <w:r>
-        <w:t xml:space="preserve"> tuning, guarded by a champion/challenger registry that only promotes models beating both a baseline and the current champion.</w:t>
-      </w:r>
-    </w:p>
-    <w:p>
-      <w:pPr>
-        <w:pStyle w:val="ListParagraph"/>
-        <w:numPr>
-          <w:ilvl w:val="0"/>
-          <w:numId w:val="1"/>
-        </w:numPr>
-        <w:spacing w:after="40"/>
-        <w:ind w:left="288" w:hanging="215"/>
-      </w:pPr>
-      <w:r>
-        <w:t xml:space="preserve">Shipped a Next.js + </w:t>
-      </w:r>
-      <w:proofErr w:type="spellStart"/>
-      <w:r>
-        <w:t>Supabase</w:t>
-      </w:r>
-      <w:proofErr w:type="spellEnd"/>
-      <w:r>
-        <w:t xml:space="preserve"> dashboard for live pipeline health, model performance, and predictions, pulling DAG status straight from the Airflow API.</w:t>
+        <w:t xml:space="preserve"> dashboard for pipeline health, model performance, and predictions.</w:t>
       </w:r>
     </w:p>
     <w:p>
@@ -1043,6 +908,13 @@
         </w:rPr>
         <w:tab/>
         <w:t xml:space="preserve">     </w:t>
+      </w:r>
+      <w:r>
+        <w:rPr>
+          <w:b/>
+          <w:bCs/>
+        </w:rPr>
+        <w:t xml:space="preserve"> </w:t>
       </w:r>
       <w:r>
         <w:rPr>
@@ -1089,7 +961,15 @@
         <w:ind w:left="288" w:hanging="215"/>
       </w:pPr>
       <w:r>
-        <w:t>Architected and deployed a production-grade Computer Vision backend on AWS EC2 and Amazon S3, containerized via Docker &amp; Docker Compose, serving a fine-tuned YOLOv11 instance segmentation model for real-time nutritional scanning and multi-class food item analysis.</w:t>
+        <w:t xml:space="preserve">Deployed a Computer Vision backend on AWS EC2 and S3 with Docker Compose, serving a fine-tuned YOLOv11 instance segmentation model for real-time food scanning and nutrition analysis, with a zero-downtime CI/CD pipeline on GitHub Actions and AWS ECR (image builds, registry sync, </w:t>
+      </w:r>
+      <w:proofErr w:type="gramStart"/>
+      <w:r>
+        <w:t>secure .env</w:t>
+      </w:r>
+      <w:proofErr w:type="gramEnd"/>
+      <w:r>
+        <w:t xml:space="preserve"> injection).</w:t>
       </w:r>
     </w:p>
     <w:p>
@@ -1103,8 +983,117 @@
         <w:ind w:left="288" w:hanging="215"/>
       </w:pPr>
       <w:r>
-        <w:t>Automated a zero-downtime CI/CD pipeline using GitHub Actions and AWS ECR, ensuring seamless image building, registry syncing, and secure .env secret injection.</w:t>
-      </w:r>
+        <w:t xml:space="preserve">Engineered a secure </w:t>
+      </w:r>
+      <w:proofErr w:type="spellStart"/>
+      <w:r>
+        <w:t>FastAPI</w:t>
+      </w:r>
+      <w:proofErr w:type="spellEnd"/>
+      <w:r>
+        <w:t xml:space="preserve"> service with admin header validation (x-admin-token), Redis caching, and dynamic ONNX model reloading that pulls weights from a private S3 bucket on startup, with fallback verification and health-check endpoints.</w:t>
+      </w:r>
+    </w:p>
+    <w:p>
+      <w:pPr>
+        <w:spacing w:after="40"/>
+        <w:rPr>
+          <w:b/>
+          <w:bCs/>
+        </w:rPr>
+      </w:pPr>
+      <w:r>
+        <w:rPr>
+          <w:b/>
+          <w:bCs/>
+        </w:rPr>
+        <w:t xml:space="preserve">YouTube Performance Predictor — Multimodal ML &amp; </w:t>
+      </w:r>
+      <w:proofErr w:type="spellStart"/>
+      <w:r>
+        <w:rPr>
+          <w:b/>
+          <w:bCs/>
+        </w:rPr>
+        <w:t>MLOps</w:t>
+      </w:r>
+      <w:proofErr w:type="spellEnd"/>
+      <w:r>
+        <w:rPr>
+          <w:b/>
+          <w:bCs/>
+        </w:rPr>
+        <w:t xml:space="preserve"> Platform</w:t>
+      </w:r>
+      <w:r>
+        <w:rPr>
+          <w:b/>
+          <w:bCs/>
+        </w:rPr>
+        <w:tab/>
+      </w:r>
+      <w:r>
+        <w:rPr>
+          <w:b/>
+          <w:bCs/>
+        </w:rPr>
+        <w:tab/>
+      </w:r>
+      <w:r>
+        <w:rPr>
+          <w:b/>
+          <w:bCs/>
+        </w:rPr>
+        <w:tab/>
+      </w:r>
+      <w:r>
+        <w:rPr>
+          <w:b/>
+          <w:bCs/>
+        </w:rPr>
+        <w:tab/>
+        <w:t xml:space="preserve">       </w:t>
+      </w:r>
+      <w:r>
+        <w:rPr>
+          <w:i/>
+          <w:iCs/>
+        </w:rPr>
+        <w:t xml:space="preserve">Oct </w:t>
+      </w:r>
+      <w:r>
+        <w:rPr>
+          <w:i/>
+          <w:iCs/>
+        </w:rPr>
+        <w:t>2026</w:t>
+      </w:r>
+    </w:p>
+    <w:p>
+      <w:pPr>
+        <w:spacing w:after="40"/>
+      </w:pPr>
+      <w:hyperlink r:id="rId13" w:history="1">
+        <w:r>
+          <w:rPr>
+            <w:rStyle w:val="Hyperlink"/>
+          </w:rPr>
+          <w:t>Live Web App</w:t>
+        </w:r>
+      </w:hyperlink>
+      <w:r>
+        <w:t xml:space="preserve"> | </w:t>
+      </w:r>
+      <w:hyperlink r:id="rId14" w:history="1">
+        <w:proofErr w:type="spellStart"/>
+        <w:r>
+          <w:rPr>
+            <w:rStyle w:val="Hyperlink"/>
+          </w:rPr>
+          <w:t>Github</w:t>
+        </w:r>
+        <w:proofErr w:type="spellEnd"/>
+      </w:hyperlink>
     </w:p>
     <w:p>
       <w:pPr>
@@ -1117,15 +1106,7 @@
         <w:ind w:left="288" w:hanging="215"/>
       </w:pPr>
       <w:r>
-        <w:t xml:space="preserve">Engineered a secure </w:t>
-      </w:r>
-      <w:proofErr w:type="spellStart"/>
-      <w:r>
-        <w:t>FastAPI</w:t>
-      </w:r>
-      <w:proofErr w:type="spellEnd"/>
-      <w:r>
-        <w:t xml:space="preserve"> service featuring cryptographic admin header validation (x-admin-token), dynamic ONNX model reloading, and Redis caching.</w:t>
+        <w:t>Built a multimodal ML service that scores a YouTube video against its channel's recent average from the thumbnail and title alone, trained on 11,285 videos (135 channels) with chronological splits and subscriber features removed to prevent target leakage.</w:t>
       </w:r>
     </w:p>
     <w:p>
@@ -1139,7 +1120,45 @@
         <w:ind w:left="288" w:hanging="215"/>
       </w:pPr>
       <w:r>
-        <w:t>Implemented cloud-native storage and retrieval workflows, enabling the API to fetch production-ready ONNX model weights directly from private S3 buckets on startup with built-in fallback verification and automated health-check endpoints.</w:t>
+        <w:t xml:space="preserve">Designed a token-level early-fusion model over frozen CLIP and tabular features, tuned with a validation-only </w:t>
+      </w:r>
+      <w:proofErr w:type="spellStart"/>
+      <w:r>
+        <w:t>Optuna</w:t>
+      </w:r>
+      <w:proofErr w:type="spellEnd"/>
+      <w:r>
+        <w:t xml:space="preserve"> search; a 5-seed ensemble reached 0.431 test Spearman, and a single model beat a tuned late-fusion baseline by +0.099 (0.373 vs. 0.274).</w:t>
+      </w:r>
+    </w:p>
+    <w:p>
+      <w:pPr>
+        <w:pStyle w:val="ListParagraph"/>
+        <w:numPr>
+          <w:ilvl w:val="0"/>
+          <w:numId w:val="1"/>
+        </w:numPr>
+        <w:spacing w:after="40"/>
+        <w:ind w:left="288" w:hanging="215"/>
+      </w:pPr>
+      <w:r>
+        <w:t xml:space="preserve">Deployed it as a </w:t>
+      </w:r>
+      <w:proofErr w:type="spellStart"/>
+      <w:r>
+        <w:t>FastAPI</w:t>
+      </w:r>
+      <w:proofErr w:type="spellEnd"/>
+      <w:r>
+        <w:t xml:space="preserve"> service on an Oracle Cloud ARM VM (Docker Compose, Caddy, API-key auth) with a </w:t>
+      </w:r>
+      <w:proofErr w:type="spellStart"/>
+      <w:r>
+        <w:t>Vercel</w:t>
+      </w:r>
+      <w:proofErr w:type="spellEnd"/>
+      <w:r>
+        <w:t xml:space="preserve"> frontend, Airflow ingestion and drift monitoring, and SHA-256-pinned model bundles with single-step rollback.</w:t>
       </w:r>
     </w:p>
     <w:p>
@@ -1202,26 +1221,46 @@
       </w:r>
       <w:proofErr w:type="spellStart"/>
       <w:r>
+        <w:t>pgvector</w:t>
+      </w:r>
+      <w:proofErr w:type="spellEnd"/>
+      <w:r>
+        <w:t xml:space="preserve">, </w:t>
+      </w:r>
+      <w:proofErr w:type="spellStart"/>
+      <w:r>
+        <w:t>MinIO</w:t>
+      </w:r>
+      <w:proofErr w:type="spellEnd"/>
+      <w:r>
+        <w:t xml:space="preserve">, </w:t>
+      </w:r>
+      <w:proofErr w:type="spellStart"/>
+      <w:r>
         <w:t>Supabase</w:t>
       </w:r>
       <w:proofErr w:type="spellEnd"/>
       <w:r>
-        <w:t>, Pandas, NumPy, Medallion Architecture</w:t>
+        <w:t>, Pandas, Medallion Architecture</w:t>
       </w:r>
     </w:p>
     <w:p>
       <w:pPr>
         <w:spacing w:after="20"/>
-      </w:pPr>
-      <w:r>
-        <w:rPr>
-          <w:b/>
-          <w:bCs/>
-        </w:rPr>
-        <w:t>Machine Learning &amp; Deep Learning:</w:t>
-      </w:r>
-      <w:r>
-        <w:t xml:space="preserve"> Scikit-Learn, </w:t>
+        <w:rPr>
+          <w:b/>
+          <w:bCs/>
+        </w:rPr>
+      </w:pPr>
+      <w:r>
+        <w:rPr>
+          <w:b/>
+          <w:bCs/>
+        </w:rPr>
+        <w:t xml:space="preserve">Machine Learning &amp; Deep Learning: </w:t>
+      </w:r>
+      <w:r>
+        <w:t xml:space="preserve">Scikit-Learn, </w:t>
       </w:r>
       <w:proofErr w:type="spellStart"/>
       <w:r>
@@ -1245,7 +1284,7 @@
       </w:r>
       <w:proofErr w:type="spellEnd"/>
       <w:r>
-        <w:t xml:space="preserve">, Computer Vision (YOLOv11, Grounding DINO), NLP (BERT), </w:t>
+        <w:t xml:space="preserve">, Multimodal Early Fusion (Cross-Attention, Transformers), Computer Vision (YOLOv11, CLIP, Grounding DINO), NLP (BERT), </w:t>
       </w:r>
       <w:proofErr w:type="spellStart"/>
       <w:r>
@@ -1278,7 +1317,15 @@
         <w:t xml:space="preserve"> &amp; Cloud: </w:t>
       </w:r>
       <w:r>
-        <w:t xml:space="preserve">Docker, GitHub Actions, CI/CD, Continuous Training Pipelines, AWS, </w:t>
+        <w:t xml:space="preserve">Docker, GitHub Actions, CI/CD, Continuous Training Pipelines, Drift Monitoring, </w:t>
+      </w:r>
+      <w:proofErr w:type="spellStart"/>
+      <w:r>
+        <w:t>FastAPI</w:t>
+      </w:r>
+      <w:proofErr w:type="spellEnd"/>
+      <w:r>
+        <w:t xml:space="preserve">, Caddy, AWS, Oracle Cloud, </w:t>
       </w:r>
       <w:proofErr w:type="spellStart"/>
       <w:r>
@@ -1287,25 +1334,6 @@
       <w:proofErr w:type="spellEnd"/>
       <w:r>
         <w:t>, Firebase</w:t>
-      </w:r>
-    </w:p>
-    <w:p>
-      <w:pPr>
-        <w:spacing w:after="20"/>
-        <w:rPr>
-          <w:b/>
-          <w:bCs/>
-        </w:rPr>
-      </w:pPr>
-      <w:r>
-        <w:rPr>
-          <w:b/>
-          <w:bCs/>
-        </w:rPr>
-        <w:t xml:space="preserve">Basic: </w:t>
-      </w:r>
-      <w:r>
-        <w:t>Dart, JavaScript</w:t>
       </w:r>
     </w:p>
     <w:sectPr>
@@ -2128,7 +2156,6 @@
   <w:style w:type="character" w:default="1" w:styleId="DefaultParagraphFont">
     <w:name w:val="Default Paragraph Font"/>
     <w:uiPriority w:val="1"/>
-    <w:semiHidden/>
     <w:unhideWhenUsed/>
   </w:style>
   <w:style w:type="table" w:default="1" w:styleId="TableNormal">

</xml_diff>